<commit_message>
Commit 2 all updated files
Updated all files
</commit_message>
<xml_diff>
--- a/Week 1/Tutorial sheet 1 - CLion Software and design.docx
+++ b/Week 1/Tutorial sheet 1 - CLion Software and design.docx
@@ -461,6 +461,12 @@
         <w:pStyle w:val="MdParagraph"/>
         <w:spacing w:after="60"/>
       </w:pPr>
+    </w:p>
+    <w:p>
+      <w:pPr>
+        <w:pStyle w:val="MdParagraph"/>
+        <w:spacing w:after="60"/>
+      </w:pPr>
       <w:r>
         <w:rPr/>
         <w:t xml:space="preserve">WHILE </w:t>
@@ -488,6 +494,7 @@
       <w:pPr>
         <w:pStyle w:val="MdParagraph"/>
         <w:spacing w:after="60"/>
+        <w:ind w:firstLine="0"/>
       </w:pPr>
       <w:r>
         <w:rPr/>
@@ -511,8 +518,19 @@
       </w:r>
       <w:r>
         <w:rPr/>
-        <w:t>kettleFull == True</w:t>
-      </w:r>
+        <w:t>kettleFull</w:t>
+      </w:r>
+      <w:r>
+        <w:rPr/>
+        <w:t xml:space="preserve"> == True</w:t>
+      </w:r>
+    </w:p>
+    <w:p>
+      <w:pPr>
+        <w:pStyle w:val="MdParagraph"/>
+        <w:spacing w:after="60"/>
+        <w:ind w:firstLine="0"/>
+      </w:pPr>
     </w:p>
     <w:p>
       <w:pPr>
@@ -529,6 +547,12 @@
         <w:pStyle w:val="MdParagraph"/>
         <w:spacing w:after="60"/>
       </w:pPr>
+    </w:p>
+    <w:p>
+      <w:pPr>
+        <w:pStyle w:val="MdParagraph"/>
+        <w:spacing w:after="60"/>
+      </w:pPr>
       <w:r>
         <w:rPr/>
         <w:t xml:space="preserve">WHILE </w:t>
@@ -549,8 +573,18 @@
       </w:pPr>
       <w:r>
         <w:rPr/>
-        <w:t>kettleTemperature += 1</w:t>
-      </w:r>
+        <w:t>kettleTemperature</w:t>
+      </w:r>
+      <w:r>
+        <w:rPr/>
+        <w:t xml:space="preserve"> += 1</w:t>
+      </w:r>
+    </w:p>
+    <w:p>
+      <w:pPr>
+        <w:pStyle w:val="MdParagraph"/>
+        <w:spacing w:after="60"/>
+      </w:pPr>
     </w:p>
     <w:p>
       <w:pPr>
@@ -1630,15 +1664,19 @@
     </w:p>
     <w:p>
       <w:pPr>
-        <w:pStyle w:val="MdSpace"/>
-        <w:spacing w:after="60"/>
+        <w:pStyle w:val="MdParagraph"/>
+      </w:pPr>
+    </w:p>
+    <w:p>
+      <w:pPr>
+        <w:pStyle w:val="MdParagraph"/>
       </w:pPr>
       <w:r>
         <w:drawing>
-          <wp:inline wp14:editId="0ED403A7" wp14:anchorId="3FE26EDE">
-            <wp:extent cx="5724525" cy="3219450"/>
+          <wp:inline wp14:editId="1FEFEA29" wp14:anchorId="4C36C979">
+            <wp:extent cx="5467350" cy="5724525"/>
             <wp:effectExtent l="0" t="0" r="0" b="0"/>
-            <wp:docPr id="276462951" name="drawing"/>
+            <wp:docPr id="1461652645" name="drawing"/>
             <wp:cNvGraphicFramePr>
               <a:graphicFrameLocks noChangeAspect="1"/>
             </wp:cNvGraphicFramePr>
@@ -1646,11 +1684,11 @@
               <a:graphicData xmlns:a="http://schemas.openxmlformats.org/drawingml/2006/main" uri="http://schemas.openxmlformats.org/drawingml/2006/picture">
                 <pic:pic xmlns:pic="http://schemas.openxmlformats.org/drawingml/2006/picture">
                   <pic:nvPicPr>
-                    <pic:cNvPr id="276462951" name="Picture 276462951"/>
+                    <pic:cNvPr id="1461652645" name="Picture 1461652645"/>
                     <pic:cNvPicPr/>
                   </pic:nvPicPr>
                   <pic:blipFill>
-                    <a:blip xmlns:r="http://schemas.openxmlformats.org/officeDocument/2006/relationships" r:embed="rId408234953">
+                    <a:blip xmlns:r="http://schemas.openxmlformats.org/officeDocument/2006/relationships" r:embed="rId63608495">
                       <a:extLst>
                         <a:ext uri="{28A0092B-C50C-407E-A947-70E740481C1C}">
                           <a14:useLocalDpi xmlns:a14="http://schemas.microsoft.com/office/drawing/2010/main"/>
@@ -1664,7 +1702,7 @@
                   <pic:spPr>
                     <a:xfrm>
                       <a:off x="0" y="0"/>
-                      <a:ext cx="5724525" cy="3219450"/>
+                      <a:ext cx="5467350" cy="5724525"/>
                     </a:xfrm>
                     <a:prstGeom prst="rect">
                       <a:avLst/>
@@ -1685,6 +1723,12 @@
     </w:p>
     <w:p>
       <w:pPr>
+        <w:pStyle w:val="MdSpace"/>
+        <w:spacing w:after="60"/>
+      </w:pPr>
+    </w:p>
+    <w:p>
+      <w:pPr>
         <w:pStyle w:val="MdHeading3"/>
       </w:pPr>
       <w:r>
@@ -1870,7 +1914,13 @@
     <w:p>
       <w:pPr>
         <w:pStyle w:val="MdListItem"/>
-        <w:ind w:left="360" w:hanging="0"/>
+        <w:ind w:left="720"/>
+      </w:pPr>
+    </w:p>
+    <w:p>
+      <w:pPr>
+        <w:pStyle w:val="MdListItem"/>
+        <w:ind w:left="720"/>
       </w:pPr>
     </w:p>
     <w:p>
@@ -1879,191 +1929,55 @@
         <w:ind w:left="360" w:hanging="0"/>
       </w:pPr>
       <w:r>
-        <w:rPr/>
-        <w:t>Pseudocode:</w:t>
+        <w:drawing>
+          <wp:inline wp14:editId="15A0B78F" wp14:anchorId="37493904">
+            <wp:extent cx="2200582" cy="4420217"/>
+            <wp:effectExtent l="0" t="0" r="0" b="0"/>
+            <wp:docPr id="1532348098" name="drawing"/>
+            <wp:cNvGraphicFramePr>
+              <a:graphicFrameLocks noChangeAspect="1"/>
+            </wp:cNvGraphicFramePr>
+            <a:graphic>
+              <a:graphicData xmlns:a="http://schemas.openxmlformats.org/drawingml/2006/main" uri="http://schemas.openxmlformats.org/drawingml/2006/picture">
+                <pic:pic xmlns:pic="http://schemas.openxmlformats.org/drawingml/2006/picture">
+                  <pic:nvPicPr>
+                    <pic:cNvPr id="1532348098" name="Picture 1532348098"/>
+                    <pic:cNvPicPr/>
+                  </pic:nvPicPr>
+                  <pic:blipFill>
+                    <a:blip xmlns:r="http://schemas.openxmlformats.org/officeDocument/2006/relationships" r:embed="rId1514311837">
+                      <a:extLst>
+                        <a:ext uri="{28A0092B-C50C-407E-A947-70E740481C1C}">
+                          <a14:useLocalDpi xmlns:a14="http://schemas.microsoft.com/office/drawing/2010/main"/>
+                        </a:ext>
+                      </a:extLst>
+                    </a:blip>
+                    <a:stretch>
+                      <a:fillRect/>
+                    </a:stretch>
+                  </pic:blipFill>
+                  <pic:spPr>
+                    <a:xfrm>
+                      <a:off x="0" y="0"/>
+                      <a:ext cx="2200582" cy="4420217"/>
+                    </a:xfrm>
+                    <a:prstGeom prst="rect">
+                      <a:avLst/>
+                    </a:prstGeom>
+                  </pic:spPr>
+                </pic:pic>
+              </a:graphicData>
+            </a:graphic>
+          </wp:inline>
+        </w:drawing>
       </w:r>
     </w:p>
     <w:p>
       <w:pPr>
         <w:pStyle w:val="MdListItem"/>
+        <w:spacing w:after="60"/>
         <w:ind w:left="360" w:hanging="0"/>
       </w:pPr>
-    </w:p>
-    <w:p>
-      <w:pPr>
-        <w:pStyle w:val="MdListItem"/>
-        <w:ind w:left="360" w:hanging="0"/>
-      </w:pPr>
-      <w:r>
-        <w:rPr/>
-        <w:t>START</w:t>
-      </w:r>
-    </w:p>
-    <w:p>
-      <w:pPr>
-        <w:pStyle w:val="MdListItem"/>
-        <w:ind w:left="360" w:hanging="0"/>
-      </w:pPr>
-      <w:r>
-        <w:rPr/>
-        <w:t>CONVERSIONCONSTANT = 2.23</w:t>
-      </w:r>
-      <w:r>
-        <w:rPr/>
-        <w:t>694</w:t>
-      </w:r>
-    </w:p>
-    <w:p>
-      <w:pPr>
-        <w:pStyle w:val="MdListItem"/>
-        <w:ind w:left="360" w:hanging="0"/>
-      </w:pPr>
-      <w:r>
-        <w:rPr/>
-        <w:t>Ensure input type is valid using while loop to check input</w:t>
-      </w:r>
-    </w:p>
-    <w:p>
-      <w:pPr>
-        <w:pStyle w:val="MdListItem"/>
-        <w:ind w:left="360" w:hanging="0"/>
-      </w:pPr>
-      <w:r>
-        <w:rPr/>
-        <w:t>speedm</w:t>
-      </w:r>
-      <w:r>
-        <w:rPr/>
-        <w:t xml:space="preserve">/s = </w:t>
-      </w:r>
-      <w:r>
-        <w:rPr/>
-        <w:t>input(</w:t>
-      </w:r>
-      <w:r>
-        <w:rPr/>
-        <w:t>“What speed would you like to convert</w:t>
-      </w:r>
-      <w:r>
-        <w:rPr/>
-        <w:t>?</w:t>
-      </w:r>
-      <w:r>
-        <w:rPr/>
-        <w:t>”)</w:t>
-      </w:r>
-    </w:p>
-    <w:p>
-      <w:pPr>
-        <w:pStyle w:val="MdListItem"/>
-        <w:ind w:left="360" w:hanging="0"/>
-      </w:pPr>
-    </w:p>
-    <w:p>
-      <w:pPr>
-        <w:pStyle w:val="MdListItem"/>
-        <w:ind w:left="360" w:hanging="0"/>
-      </w:pPr>
-    </w:p>
-    <w:p>
-      <w:pPr>
-        <w:pStyle w:val="MdListItem"/>
-        <w:ind w:left="360" w:hanging="0"/>
-      </w:pPr>
-    </w:p>
-    <w:p>
-      <w:pPr>
-        <w:pStyle w:val="MdListItem"/>
-        <w:ind w:left="360" w:hanging="0"/>
-      </w:pPr>
-      <w:r>
-        <w:rPr/>
-        <w:t>speedmph</w:t>
-      </w:r>
-      <w:r>
-        <w:rPr/>
-        <w:t xml:space="preserve"> = </w:t>
-      </w:r>
-      <w:r>
-        <w:rPr/>
-        <w:t>speedm</w:t>
-      </w:r>
-      <w:r>
-        <w:rPr/>
-        <w:t>/s *</w:t>
-      </w:r>
-      <w:r>
-        <w:rPr/>
-        <w:t xml:space="preserve"> CONVERSIONCONSTANT</w:t>
-      </w:r>
-    </w:p>
-    <w:p>
-      <w:pPr>
-        <w:pStyle w:val="MdListItem"/>
-        <w:ind w:left="360" w:hanging="0"/>
-      </w:pPr>
-      <w:r>
-        <w:rPr/>
-        <w:t>print(</w:t>
-      </w:r>
-      <w:r>
-        <w:rPr/>
-        <w:t>speedm</w:t>
-      </w:r>
-      <w:r>
-        <w:rPr/>
-        <w:t xml:space="preserve">/s </w:t>
-      </w:r>
-      <w:r>
-        <w:rPr/>
-        <w:t>+ ”</w:t>
-      </w:r>
-      <w:r>
-        <w:rPr/>
-        <w:t xml:space="preserve"> in mph is” + </w:t>
-      </w:r>
-      <w:r>
-        <w:rPr/>
-        <w:t>speedmph</w:t>
-      </w:r>
-      <w:r>
-        <w:rPr/>
-        <w:t>)</w:t>
-      </w:r>
-    </w:p>
-    <w:p>
-      <w:pPr>
-        <w:pStyle w:val="MdListItem"/>
-        <w:ind w:left="360" w:hanging="0"/>
-      </w:pPr>
-      <w:r>
-        <w:rPr/>
-        <w:t xml:space="preserve">restart = </w:t>
-      </w:r>
-      <w:r>
-        <w:rPr/>
-        <w:t>input(</w:t>
-      </w:r>
-      <w:r>
-        <w:rPr/>
-        <w:t>“Would you like to run the program again?”)</w:t>
-      </w:r>
-    </w:p>
-    <w:p>
-      <w:pPr>
-        <w:pStyle w:val="MdListItem"/>
-        <w:ind w:left="360" w:hanging="0"/>
-      </w:pPr>
-    </w:p>
-    <w:p>
-      <w:pPr>
-        <w:pStyle w:val="MdListItem"/>
-        <w:ind w:left="360" w:hanging="0"/>
-      </w:pPr>
-      <w:r>
-        <w:rPr/>
-        <w:t>END</w:t>
-      </w:r>
     </w:p>
     <w:p>
       <w:pPr>
@@ -2140,6 +2054,7 @@
         <w:t>Hint:</w:t>
       </w:r>
       <w:r>
+        <w:rPr/>
         <w:t xml:space="preserve"> You will need to use </w:t>
       </w:r>
       <w:proofErr w:type="spellStart"/>
@@ -2151,6 +2066,7 @@
       </w:r>
       <w:proofErr w:type="spellEnd"/>
       <w:r>
+        <w:rPr/>
         <w:t xml:space="preserve"> to display messages and </w:t>
       </w:r>
       <w:proofErr w:type="spellStart"/>
@@ -2162,6 +2078,7 @@
       </w:r>
       <w:proofErr w:type="spellEnd"/>
       <w:r>
+        <w:rPr/>
         <w:t xml:space="preserve"> to read the user's input. Remember to use the correct format specifier for floating-point numbers (</w:t>
       </w:r>
       <w:r>
@@ -2171,6 +2088,7 @@
         <w:t>%f</w:t>
       </w:r>
       <w:r>
+        <w:rPr/>
         <w:t>).</w:t>
       </w:r>
     </w:p>
@@ -2179,6 +2097,49 @@
         <w:pStyle w:val="MdSpace"/>
         <w:spacing w:after="60"/>
       </w:pPr>
+      <w:r>
+        <w:drawing>
+          <wp:inline wp14:editId="587AB647" wp14:anchorId="2281A209">
+            <wp:extent cx="5724525" cy="4467225"/>
+            <wp:effectExtent l="0" t="0" r="0" b="0"/>
+            <wp:docPr id="520578746" name="drawing"/>
+            <wp:cNvGraphicFramePr>
+              <a:graphicFrameLocks noChangeAspect="1"/>
+            </wp:cNvGraphicFramePr>
+            <a:graphic>
+              <a:graphicData xmlns:a="http://schemas.openxmlformats.org/drawingml/2006/main" uri="http://schemas.openxmlformats.org/drawingml/2006/picture">
+                <pic:pic xmlns:pic="http://schemas.openxmlformats.org/drawingml/2006/picture">
+                  <pic:nvPicPr>
+                    <pic:cNvPr id="520578746" name="Picture 520578746"/>
+                    <pic:cNvPicPr/>
+                  </pic:nvPicPr>
+                  <pic:blipFill>
+                    <a:blip xmlns:r="http://schemas.openxmlformats.org/officeDocument/2006/relationships" r:embed="rId1828305643">
+                      <a:extLst>
+                        <a:ext uri="{28A0092B-C50C-407E-A947-70E740481C1C}">
+                          <a14:useLocalDpi xmlns:a14="http://schemas.microsoft.com/office/drawing/2010/main"/>
+                        </a:ext>
+                      </a:extLst>
+                    </a:blip>
+                    <a:stretch>
+                      <a:fillRect/>
+                    </a:stretch>
+                  </pic:blipFill>
+                  <pic:spPr>
+                    <a:xfrm>
+                      <a:off x="0" y="0"/>
+                      <a:ext cx="5724525" cy="4467225"/>
+                    </a:xfrm>
+                    <a:prstGeom prst="rect">
+                      <a:avLst/>
+                    </a:prstGeom>
+                  </pic:spPr>
+                </pic:pic>
+              </a:graphicData>
+            </a:graphic>
+          </wp:inline>
+        </w:drawing>
+      </w:r>
     </w:p>
     <w:p>
       <w:pPr>

</xml_diff>